<commit_message>
Fixed Project 2 report
</commit_message>
<xml_diff>
--- a/2. Assignment 2 - Tiny Shakespeare Memory Duel Assignment/Extras/Tiny Shakespeare Memory Duel Assignment Report.docx
+++ b/2. Assignment 2 - Tiny Shakespeare Memory Duel Assignment/Extras/Tiny Shakespeare Memory Duel Assignment Report.docx
@@ -322,7 +322,27 @@
           <w:sz w:val="28"/>
           <w:szCs w:val="28"/>
         </w:rPr>
-        <w:t xml:space="preserve">Assignment 1: Tiny Shakespeare Memory Duel  </w:t>
+        <w:t xml:space="preserve">Assignment </w:t>
+      </w:r>
+      <w:r>
+        <w:rPr>
+          <w:rFonts w:asciiTheme="majorBidi" w:hAnsiTheme="majorBidi" w:cstheme="majorBidi"/>
+          <w:i/>
+          <w:iCs/>
+          <w:sz w:val="28"/>
+          <w:szCs w:val="28"/>
+        </w:rPr>
+        <w:t>2</w:t>
+      </w:r>
+      <w:r>
+        <w:rPr>
+          <w:rFonts w:asciiTheme="majorBidi" w:hAnsiTheme="majorBidi" w:cstheme="majorBidi"/>
+          <w:i/>
+          <w:iCs/>
+          <w:sz w:val="28"/>
+          <w:szCs w:val="28"/>
+        </w:rPr>
+        <w:t xml:space="preserve">: Tiny Shakespeare Memory Duel  </w:t>
       </w:r>
     </w:p>
     <w:p>
@@ -938,13 +958,7 @@
         <w:rPr>
           <w:rFonts w:asciiTheme="majorBidi" w:hAnsiTheme="majorBidi" w:cstheme="majorBidi"/>
         </w:rPr>
-        <w:t>The extreme reduction to 5% of the corpus was necessitated by the computational cost of pure-NumPy BPTT, which lacks the vectorised GPU acceleration that frameworks provide. This design decision introduces a significant constraint: both models, and particularly the Elman network which requires more data to learn effective hidden-state representations, are trained on a dataset that may be too small for the latent-space recurrence to converge fully. The validation set at 5,577 characters is compact enough tha</w:t>
-      </w:r>
-      <w:r>
-        <w:rPr>
-          <w:rFonts w:asciiTheme="majorBidi" w:hAnsiTheme="majorBidi" w:cstheme="majorBidi"/>
-        </w:rPr>
-        <w:t>t per-epoch metric fluctuations may partly reflect sample variance rather than true generalisation trends.</w:t>
+        <w:t>The extreme reduction to 5% of the corpus was necessitated by the computational cost of pure-NumPy BPTT, which lacks the vectorised GPU acceleration that frameworks provide. This design decision introduces a significant constraint: both models, and particularly the Elman network which requires more data to learn effective hidden-state representations, are trained on a dataset that may be too small for the latent-space recurrence to converge fully. The validation set at 5,577 characters is compact enough that per-epoch metric fluctuations may partly reflect sample variance rather than true generalisation trends.</w:t>
       </w:r>
     </w:p>
     <w:p>
@@ -2722,13 +2736,7 @@
         <w:rPr>
           <w:rFonts w:asciiTheme="majorBidi" w:hAnsiTheme="majorBidi" w:cstheme="majorBidi"/>
         </w:rPr>
-        <w:t>The diagram makes the critical architectural distinction visually intuitive. The Elman hidden-to-hidden connection creates a multiplicative gradient path of depth T during BPTT, which is the root cause of the training instability observed in Section 3. The Jordan output-to-hidden connection, combined with the stop-gradient treatment of the previous output, keeps gradient flow local to a single time step. Notably, the hidden-to-hidden weight matrix in the Elman network accounts for 16,384 parameters (128 x 1</w:t>
-      </w:r>
-      <w:r>
-        <w:rPr>
-          <w:rFonts w:asciiTheme="majorBidi" w:hAnsiTheme="majorBidi" w:cstheme="majorBidi"/>
-        </w:rPr>
-        <w:t>28), which constitutes the entire difference between the Elman network total of 31,675 and the Jordan network total of 22,843 trainable parameters.</w:t>
+        <w:t>The diagram makes the critical architectural distinction visually intuitive. The Elman hidden-to-hidden connection creates a multiplicative gradient path of depth T during BPTT, which is the root cause of the training instability observed in Section 3. The Jordan output-to-hidden connection, combined with the stop-gradient treatment of the previous output, keeps gradient flow local to a single time step. Notably, the hidden-to-hidden weight matrix in the Elman network accounts for 16,384 parameters (128 x 128), which constitutes the entire difference between the Elman network total of 31,675 and the Jordan network total of 22,843 trainable parameters.</w:t>
       </w:r>
     </w:p>
     <w:p>
@@ -2744,13 +2752,7 @@
         <w:rPr>
           <w:rFonts w:asciiTheme="majorBidi" w:hAnsiTheme="majorBidi" w:cstheme="majorBidi"/>
         </w:rPr>
-        <w:t>The diagram establishes the theoretical expectation that the Elman network should, in principle, have greater representational capacity due to the richer latent-state recurrence, but at the cost of optimisation difficulty. The Jordan network trades off this capacity for stability, a trade-off that proves decisively advantageous under the experimental conditions tested. The conditional independence of Jordan hidden states given the output sequence is a structurally important property: it means the Jordan net</w:t>
-      </w:r>
-      <w:r>
-        <w:rPr>
-          <w:rFonts w:asciiTheme="majorBidi" w:hAnsiTheme="majorBidi" w:cstheme="majorBidi"/>
-        </w:rPr>
-        <w:t>work cannot, in principle, maintain information that is not reflected in its output distribution, whereas the Elman network can encode latent information in its hidden state that is never directly expressed in the output.</w:t>
+        <w:t>The diagram establishes the theoretical expectation that the Elman network should, in principle, have greater representational capacity due to the richer latent-state recurrence, but at the cost of optimisation difficulty. The Jordan network trades off this capacity for stability, a trade-off that proves decisively advantageous under the experimental conditions tested. The conditional independence of Jordan hidden states given the output sequence is a structurally important property: it means the Jordan network cannot, in principle, maintain information that is not reflected in its output distribution, whereas the Elman network can encode latent information in its hidden state that is never directly expressed in the output.</w:t>
       </w:r>
     </w:p>
     <w:p>
@@ -4237,16 +4239,7 @@
             <w:rPr>
               <w:rFonts w:ascii="Cambria Math" w:hAnsi="Cambria Math" w:cstheme="majorBidi"/>
             </w:rPr>
-            <m:t>α</m:t>
-          </m:r>
-          <m:r>
-            <m:rPr>
-              <m:sty m:val="p"/>
-            </m:rPr>
-            <w:rPr>
-              <w:rFonts w:ascii="Cambria Math" w:hAnsi="Cambria Math" w:cstheme="majorBidi"/>
-            </w:rPr>
-            <m:t>⋅</m:t>
+            <m:t>α⋅</m:t>
           </m:r>
           <m:f>
             <m:fPr>
@@ -5243,13 +5236,7 @@
         <w:rPr>
           <w:rFonts w:asciiTheme="majorBidi" w:hAnsiTheme="majorBidi" w:cstheme="majorBidi"/>
         </w:rPr>
-        <w:t>The choice of a fixed learning rate with no schedule is particularly consequential for the results observed in Section 3: the Elman network instability after epoch 3 would likely be mitigated by reducing the learning rate once initial rapid learning has occurred. The sequence length of 50 is a double-edged sword: it provides a longer temporal context window, but it also lengthens the BPTT unrolling, amplifying gradient issues in the Elman network. The absence of an adaptive optimiser (Adam, RMSProp) is by d</w:t>
-      </w:r>
-      <w:r>
-        <w:rPr>
-          <w:rFonts w:asciiTheme="majorBidi" w:hAnsiTheme="majorBidi" w:cstheme="majorBidi"/>
-        </w:rPr>
-        <w:t>esign in accordance with course requirements, but it disadvantages the Elman network disproportionately, since the hidden-to-hidden gradient interactions would benefit most from per-parameter learning rate adaptation.</w:t>
+        <w:t>The choice of a fixed learning rate with no schedule is particularly consequential for the results observed in Section 3: the Elman network instability after epoch 3 would likely be mitigated by reducing the learning rate once initial rapid learning has occurred. The sequence length of 50 is a double-edged sword: it provides a longer temporal context window, but it also lengthens the BPTT unrolling, amplifying gradient issues in the Elman network. The absence of an adaptive optimiser (Adam, RMSProp) is by design in accordance with course requirements, but it disadvantages the Elman network disproportionately, since the hidden-to-hidden gradient interactions would benefit most from per-parameter learning rate adaptation.</w:t>
       </w:r>
     </w:p>
     <w:p>
@@ -6095,18 +6082,7 @@
             <w:sz w:val="20"/>
             <w:szCs w:val="20"/>
           </w:rPr>
-          <m:t>τ</m:t>
-        </m:r>
-        <m:r>
-          <m:rPr>
-            <m:sty m:val="p"/>
-          </m:rPr>
-          <w:rPr>
-            <w:rFonts w:ascii="Cambria Math" w:eastAsia="Courier New" w:hAnsi="Cambria Math" w:cstheme="majorBidi"/>
-            <w:sz w:val="20"/>
-            <w:szCs w:val="20"/>
-          </w:rPr>
-          <m:t>∈</m:t>
+          <m:t>τ∈</m:t>
         </m:r>
         <m:r>
           <m:rPr>
@@ -6477,13 +6453,7 @@
         <w:rPr>
           <w:rFonts w:asciiTheme="majorBidi" w:hAnsiTheme="majorBidi" w:cstheme="majorBidi"/>
         </w:rPr>
-        <w:t>One would expect the Elman network to converge more slowly than the Jordan network given its larger parameter space and more complex gradient dynamics, but the degree of instability, with validation loss nearly reaching the random baseline of approximately 4.08 nats, is more severe than anticipated. This is likely a compounding effect of the small dataset (5%), the long sequence length (50), and the fixed learning rate. The Elman validation loss curve exhibits a pronounced hump pattern (decrease followed by</w:t>
-      </w:r>
-      <w:r>
-        <w:rPr>
-          <w:rFonts w:asciiTheme="majorBidi" w:hAnsiTheme="majorBidi" w:cstheme="majorBidi"/>
-        </w:rPr>
-        <w:t xml:space="preserve"> sharp increase followed by partial recovery), which is consistent with the optimisation trajectory passing through an unstable saddle region in the loss </w:t>
+        <w:t xml:space="preserve">One would expect the Elman network to converge more slowly than the Jordan network given its larger parameter space and more complex gradient dynamics, but the degree of instability, with validation loss nearly reaching the random baseline of approximately 4.08 nats, is more severe than anticipated. This is likely a compounding effect of the small dataset (5%), the long sequence length (50), and the fixed learning rate. The Elman validation loss curve exhibits a pronounced hump pattern (decrease followed by sharp increase followed by partial recovery), which is consistent with the optimisation trajectory passing through an unstable saddle region in the loss </w:t>
       </w:r>
       <w:r>
         <w:rPr>
@@ -6599,13 +6569,7 @@
         <w:rPr>
           <w:rFonts w:asciiTheme="majorBidi" w:hAnsiTheme="majorBidi" w:cstheme="majorBidi"/>
         </w:rPr>
-        <w:t>The shaded-area visualisation makes the dominance of the Jordan network visually unambiguous. The pink shading covers the entire area between the two curves, with no epoch showing an Elman advantage. The maximum gap occurs around epoch 7 to 8, where the Elman validation loss peaks near 4.8 nats while the Jordan sits below 2.3 nats, a difference of approximately 2.5 nats. This figure is particularly effective for communicating the result to a reader who might question whether the Elman network instability is</w:t>
-      </w:r>
-      <w:r>
-        <w:rPr>
-          <w:rFonts w:asciiTheme="majorBidi" w:hAnsiTheme="majorBidi" w:cstheme="majorBidi"/>
-        </w:rPr>
-        <w:t xml:space="preserve"> transient: the overlay confirms that the Jordan network is uniformly superior at every measured point throughout training.</w:t>
+        <w:t>The shaded-area visualisation makes the dominance of the Jordan network visually unambiguous. The pink shading covers the entire area between the two curves, with no epoch showing an Elman advantage. The maximum gap occurs around epoch 7 to 8, where the Elman validation loss peaks near 4.8 nats while the Jordan sits below 2.3 nats, a difference of approximately 2.5 nats. This figure is particularly effective for communicating the result to a reader who might question whether the Elman network instability is transient: the overlay confirms that the Jordan network is uniformly superior at every measured point throughout training.</w:t>
       </w:r>
     </w:p>
     <w:p>
@@ -6799,13 +6763,7 @@
         <w:rPr>
           <w:rFonts w:asciiTheme="majorBidi" w:hAnsiTheme="majorBidi" w:cstheme="majorBidi"/>
         </w:rPr>
-        <w:t>The near-zero gap between Jordan training and validation accuracy is a strong indicator that the model is not overfitting, consistent with its smaller parameter count of 22,843 and the regularising effect of output-space recurrence. The Elman network erratic accuracy trajectory mirrors its unstable loss curve: periods of improvement are followed by regression, suggesting that gradient instability periodically corrupts learned representations. An accuracy ceiling of approximately 36% for a character-level mo</w:t>
-      </w:r>
-      <w:r>
-        <w:rPr>
-          <w:rFonts w:asciiTheme="majorBidi" w:hAnsiTheme="majorBidi" w:cstheme="majorBidi"/>
-        </w:rPr>
-        <w:t>del on Shakespearean text is reasonable, given the inherent ambiguity of character prediction where many characters are plausible after a space or line break. The Elman failure to consistently exceed 20% is worse than expected for a model with 31,675 parameters and 12 epochs of training, and reflects the severity of the optimisation instability rather than a fundamental incapacity of the architecture.</w:t>
+        <w:t>The near-zero gap between Jordan training and validation accuracy is a strong indicator that the model is not overfitting, consistent with its smaller parameter count of 22,843 and the regularising effect of output-space recurrence. The Elman network erratic accuracy trajectory mirrors its unstable loss curve: periods of improvement are followed by regression, suggesting that gradient instability periodically corrupts learned representations. An accuracy ceiling of approximately 36% for a character-level model on Shakespearean text is reasonable, given the inherent ambiguity of character prediction where many characters are plausible after a space or line break. The Elman failure to consistently exceed 20% is worse than expected for a model with 31,675 parameters and 12 epochs of training, and reflects the severity of the optimisation instability rather than a fundamental incapacity of the architecture.</w:t>
       </w:r>
     </w:p>
     <w:p>
@@ -6932,13 +6890,7 @@
         <w:rPr>
           <w:rFonts w:asciiTheme="majorBidi" w:hAnsiTheme="majorBidi" w:cstheme="majorBidi"/>
         </w:rPr>
-        <w:t>The fact that the Elman perplexity temporarily exceeds the random baseline is a striking anomaly that warrants special attention. A perplexity exceeding the vocabulary size indicates that the model is assigning very low probabilities to the correct characters, lower even than 1/59, which suggests that the unstable weight updates have pushed the output distribution to be anti-correlated with the true character distribution during the affected epochs (approximately epochs 5 through 9). This phenomenon confirm</w:t>
-      </w:r>
-      <w:r>
-        <w:rPr>
-          <w:rFonts w:asciiTheme="majorBidi" w:hAnsiTheme="majorBidi" w:cstheme="majorBidi"/>
-        </w:rPr>
-        <w:t>s that the gradient instability is not merely slowing learning but is actively destroying previously learned representations during those epochs.</w:t>
+        <w:t>The fact that the Elman perplexity temporarily exceeds the random baseline is a striking anomaly that warrants special attention. A perplexity exceeding the vocabulary size indicates that the model is assigning very low probabilities to the correct characters, lower even than 1/59, which suggests that the unstable weight updates have pushed the output distribution to be anti-correlated with the true character distribution during the affected epochs (approximately epochs 5 through 9). This phenomenon confirms that the gradient instability is not merely slowing learning but is actively destroying previously learned representations during those epochs.</w:t>
       </w:r>
     </w:p>
     <w:p>
@@ -8788,13 +8740,7 @@
         <w:rPr>
           <w:rFonts w:asciiTheme="majorBidi" w:hAnsiTheme="majorBidi" w:cstheme="majorBidi"/>
         </w:rPr>
-        <w:t>The tables quantitatively consolidate the narrative established by Figures 3 through 6. The Jordan network dominance is not marginal but overwhelming across every dimension of evaluation. The consistency of Jordan superiority in both training and validation metrics, and in both loss-based and accuracy-based measures, confirms that the result is robust and not an artefact of any single metric choice. A particularly noteworthy entry is the trainable parameter count: the Elman network possesses 38.7% more para</w:t>
-      </w:r>
-      <w:r>
-        <w:rPr>
-          <w:rFonts w:asciiTheme="majorBidi" w:hAnsiTheme="majorBidi" w:cstheme="majorBidi"/>
-        </w:rPr>
-        <w:t>meters yet performs substantially worse, a counterintuitive result that is entirely explained by the optimisation landscape where the additional hidden-to-hidden matrix adds parameters that are difficult to optimise with plain SGD and BPTT, turning the extra capacity into a liability rather than an asset.</w:t>
+        <w:t>The tables quantitatively consolidate the narrative established by Figures 3 through 6. The Jordan network dominance is not marginal but overwhelming across every dimension of evaluation. The consistency of Jordan superiority in both training and validation metrics, and in both loss-based and accuracy-based measures, confirms that the result is robust and not an artefact of any single metric choice. A particularly noteworthy entry is the trainable parameter count: the Elman network possesses 38.7% more parameters yet performs substantially worse, a counterintuitive result that is entirely explained by the optimisation landscape where the additional hidden-to-hidden matrix adds parameters that are difficult to optimise with plain SGD and BPTT, turning the extra capacity into a liability rather than an asset.</w:t>
       </w:r>
     </w:p>
     <w:p>
@@ -8961,13 +8907,7 @@
         <w:rPr>
           <w:rFonts w:asciiTheme="majorBidi" w:hAnsiTheme="majorBidi" w:cstheme="majorBidi"/>
         </w:rPr>
-        <w:t>The monotonic entropy increase with temperature is exactly as predicted by theory. The Jordan-Elman entropy gap is a novel empirical finding that adds nuance beyond the loss and accuracy metrics: it demonstrates that the Jordan network advantage extends to the quality of its entire output distribution, not just its top-1 predictions. The Jordan network produces higher entropy because it has a richer distributional model to sample from. Its learned probability landscape spreads mass across more characters in</w:t>
-      </w:r>
-      <w:r>
-        <w:rPr>
-          <w:rFonts w:asciiTheme="majorBidi" w:hAnsiTheme="majorBidi" w:cstheme="majorBidi"/>
-        </w:rPr>
-        <w:t xml:space="preserve"> a structured way, whereas the Elman network at low temperature collapses onto a small number of high-frequency character bigrams, yielding lower entropy through degenerate repetition rather than focused coherence.</w:t>
+        <w:t>The monotonic entropy increase with temperature is exactly as predicted by theory. The Jordan-Elman entropy gap is a novel empirical finding that adds nuance beyond the loss and accuracy metrics: it demonstrates that the Jordan network advantage extends to the quality of its entire output distribution, not just its top-1 predictions. The Jordan network produces higher entropy because it has a richer distributional model to sample from. Its learned probability landscape spreads mass across more characters in a structured way, whereas the Elman network at low temperature collapses onto a small number of high-frequency character bigrams, yielding lower entropy through degenerate repetition rather than focused coherence.</w:t>
       </w:r>
     </w:p>
     <w:p>
@@ -9413,13 +9353,7 @@
         <w:rPr>
           <w:rFonts w:asciiTheme="majorBidi" w:hAnsiTheme="majorBidi" w:cstheme="majorBidi"/>
         </w:rPr>
-        <w:t>The generated text qualitatively confirms the quantitative findings from Sections 3.1 through 3.4. At low temperature, the Elman network has essentially learned only character-pair frequency statistics: it can produce common bigrams such as th, mh, and ch, but cannot assemble them into words. The Jordan network, while far from producing intelligible prose, has captured word-level and formatting-level regularities. At the medium temperature of 0.8, the presence of spaces, punctuation, capitalisation patterns</w:t>
-      </w:r>
-      <w:r>
-        <w:rPr>
-          <w:rFonts w:asciiTheme="majorBidi" w:hAnsiTheme="majorBidi" w:cstheme="majorBidi"/>
-        </w:rPr>
-        <w:t>, and approximate word lengths indicates that the output-distribution feedback mechanism allows the network to maintain short-term coherence across several characters. This aligns with the theoretical expectation: feeding back the previous output provides the network with an explicit summary of what it just predicted, which is directly useful for deciding what should come next.</w:t>
+        <w:t>The generated text qualitatively confirms the quantitative findings from Sections 3.1 through 3.4. At low temperature, the Elman network has essentially learned only character-pair frequency statistics: it can produce common bigrams such as th, mh, and ch, but cannot assemble them into words. The Jordan network, while far from producing intelligible prose, has captured word-level and formatting-level regularities. At the medium temperature of 0.8, the presence of spaces, punctuation, capitalisation patterns, and approximate word lengths indicates that the output-distribution feedback mechanism allows the network to maintain short-term coherence across several characters. This aligns with the theoretical expectation: feeding back the previous output provides the network with an explicit summary of what it just predicted, which is directly useful for deciding what should come next.</w:t>
       </w:r>
     </w:p>
     <w:p>
@@ -9435,13 +9369,7 @@
         <w:rPr>
           <w:rFonts w:asciiTheme="majorBidi" w:hAnsiTheme="majorBidi" w:cstheme="majorBidi"/>
         </w:rPr>
-        <w:t>At high temperature (1.2), both models produce mostly incoherent output, as expected when the distribution is flattened. Even here, the Jordan network retains some structural markers such as character names in uppercase and colons after names, whereas the Elman network generates a near-random character sequence. At 5% corpus size and 12 epochs, one would not expect either model to produce readable Shakespeare. The Elman output is, however, worse than expected: it has not even learned to produce recognisable</w:t>
-      </w:r>
-      <w:r>
-        <w:rPr>
-          <w:rFonts w:asciiTheme="majorBidi" w:hAnsiTheme="majorBidi" w:cstheme="majorBidi"/>
-        </w:rPr>
-        <w:t xml:space="preserve"> English words, which a well-trained character-level RNN with 128 hidden units should achieve relatively quickly. This underperformance is entirely consistent with the training instability documented in the preceding figures. The Jordan output at medium temperature exceeds expectations for its training scale, suggesting that the output-feedback inductive bias is a particularly powerful prior for character-level language modelling.</w:t>
+        <w:t>At high temperature (1.2), both models produce mostly incoherent output, as expected when the distribution is flattened. Even here, the Jordan network retains some structural markers such as character names in uppercase and colons after names, whereas the Elman network generates a near-random character sequence. At 5% corpus size and 12 epochs, one would not expect either model to produce readable Shakespeare. The Elman output is, however, worse than expected: it has not even learned to produce recognisable English words, which a well-trained character-level RNN with 128 hidden units should achieve relatively quickly. This underperformance is entirely consistent with the training instability documented in the preceding figures. The Jordan output at medium temperature exceeds expectations for its training scale, suggesting that the output-feedback inductive bias is a particularly powerful prior for character-level language modelling.</w:t>
       </w:r>
     </w:p>
     <w:p>

</xml_diff>